<commit_message>
Add C training files
</commit_message>
<xml_diff>
--- a/C_PGMG/C PRACTICE DAY 2,3.docx
+++ b/C_PGMG/C PRACTICE DAY 2,3.docx
@@ -242,6 +242,9 @@
         <w:jc w:val="center"/>
       </w:pPr>
       <w:r>
+        <w:rPr>
+          <w:noProof/>
+        </w:rPr>
         <w:lastRenderedPageBreak/>
         <w:drawing>
           <wp:inline distT="0" distB="0" distL="0" distR="0" wp14:anchorId="0E2B3922" wp14:editId="7BA2FF74">
@@ -280,6 +283,9 @@
         </w:drawing>
       </w:r>
       <w:r>
+        <w:rPr>
+          <w:noProof/>
+        </w:rPr>
         <w:drawing>
           <wp:inline distT="0" distB="0" distL="0" distR="0" wp14:anchorId="3948E812" wp14:editId="23A5663C">
             <wp:extent cx="5943600" cy="2646680"/>
@@ -317,6 +323,9 @@
         </w:drawing>
       </w:r>
       <w:r>
+        <w:rPr>
+          <w:noProof/>
+        </w:rPr>
         <w:drawing>
           <wp:inline distT="0" distB="0" distL="0" distR="0" wp14:anchorId="6FD15CAA" wp14:editId="1E96BB3B">
             <wp:extent cx="5943600" cy="2587625"/>
@@ -354,6 +363,9 @@
         </w:drawing>
       </w:r>
       <w:r>
+        <w:rPr>
+          <w:noProof/>
+        </w:rPr>
         <w:lastRenderedPageBreak/>
         <w:drawing>
           <wp:inline distT="0" distB="0" distL="0" distR="0" wp14:anchorId="6C93090A" wp14:editId="6DBE9047">
@@ -392,6 +404,9 @@
         </w:drawing>
       </w:r>
       <w:r>
+        <w:rPr>
+          <w:noProof/>
+        </w:rPr>
         <w:drawing>
           <wp:inline distT="0" distB="0" distL="0" distR="0" wp14:anchorId="476FE8F6" wp14:editId="23B0B4D4">
             <wp:extent cx="5943600" cy="2533650"/>
@@ -429,6 +444,9 @@
         </w:drawing>
       </w:r>
       <w:r>
+        <w:rPr>
+          <w:noProof/>
+        </w:rPr>
         <w:drawing>
           <wp:inline distT="0" distB="0" distL="0" distR="0" wp14:anchorId="2B59EB80" wp14:editId="100A3D35">
             <wp:extent cx="5943600" cy="2241550"/>
@@ -466,6 +484,9 @@
         </w:drawing>
       </w:r>
       <w:r>
+        <w:rPr>
+          <w:noProof/>
+        </w:rPr>
         <w:lastRenderedPageBreak/>
         <w:drawing>
           <wp:inline distT="0" distB="0" distL="0" distR="0" wp14:anchorId="50F97ACF" wp14:editId="7F1C9DF4">
@@ -504,6 +525,9 @@
         </w:drawing>
       </w:r>
       <w:r>
+        <w:rPr>
+          <w:noProof/>
+        </w:rPr>
         <w:drawing>
           <wp:inline distT="0" distB="0" distL="0" distR="0" wp14:anchorId="669E3E31" wp14:editId="525C4AC2">
             <wp:extent cx="5943600" cy="3244850"/>
@@ -541,6 +565,9 @@
         </w:drawing>
       </w:r>
       <w:r>
+        <w:rPr>
+          <w:noProof/>
+        </w:rPr>
         <w:lastRenderedPageBreak/>
         <w:drawing>
           <wp:inline distT="0" distB="0" distL="0" distR="0" wp14:anchorId="0D1D9EA7" wp14:editId="19320CFC">
@@ -579,6 +606,9 @@
         </w:drawing>
       </w:r>
       <w:r>
+        <w:rPr>
+          <w:noProof/>
+        </w:rPr>
         <w:drawing>
           <wp:inline distT="0" distB="0" distL="0" distR="0" wp14:anchorId="26B42DA7" wp14:editId="4B739C72">
             <wp:extent cx="5943600" cy="2394585"/>
@@ -616,6 +646,9 @@
         </w:drawing>
       </w:r>
       <w:r>
+        <w:rPr>
+          <w:noProof/>
+        </w:rPr>
         <w:drawing>
           <wp:inline distT="0" distB="0" distL="0" distR="0" wp14:anchorId="6C038FFA" wp14:editId="6FCB91F9">
             <wp:extent cx="5943600" cy="2124710"/>
@@ -653,6 +686,9 @@
         </w:drawing>
       </w:r>
       <w:r>
+        <w:rPr>
+          <w:noProof/>
+        </w:rPr>
         <w:lastRenderedPageBreak/>
         <w:drawing>
           <wp:inline distT="0" distB="0" distL="0" distR="0" wp14:anchorId="2EB6CB68" wp14:editId="097AA7D3">
@@ -691,6 +727,9 @@
         </w:drawing>
       </w:r>
       <w:r>
+        <w:rPr>
+          <w:noProof/>
+        </w:rPr>
         <w:drawing>
           <wp:inline distT="0" distB="0" distL="0" distR="0" wp14:anchorId="1B44FBBC" wp14:editId="50379569">
             <wp:extent cx="5943600" cy="3532505"/>
@@ -728,6 +767,9 @@
         </w:drawing>
       </w:r>
       <w:r>
+        <w:rPr>
+          <w:noProof/>
+        </w:rPr>
         <w:drawing>
           <wp:inline distT="0" distB="0" distL="0" distR="0" wp14:anchorId="7896FF2D" wp14:editId="082CFCF2">
             <wp:extent cx="5943600" cy="2192655"/>
@@ -770,6 +812,9 @@
         <w:jc w:val="center"/>
       </w:pPr>
       <w:r>
+        <w:rPr>
+          <w:noProof/>
+        </w:rPr>
         <w:lastRenderedPageBreak/>
         <w:drawing>
           <wp:inline distT="0" distB="0" distL="0" distR="0" wp14:anchorId="04F63571" wp14:editId="2F3BCF60">
@@ -818,6 +863,9 @@
         <w:jc w:val="center"/>
       </w:pPr>
       <w:r>
+        <w:rPr>
+          <w:noProof/>
+        </w:rPr>
         <w:drawing>
           <wp:inline distT="0" distB="0" distL="0" distR="0" wp14:anchorId="2A5C855E" wp14:editId="1C7D1B7E">
             <wp:extent cx="5943600" cy="2945765"/>
@@ -860,6 +908,9 @@
         <w:jc w:val="center"/>
       </w:pPr>
       <w:r>
+        <w:rPr>
+          <w:noProof/>
+        </w:rPr>
         <w:lastRenderedPageBreak/>
         <w:drawing>
           <wp:inline distT="0" distB="0" distL="0" distR="0" wp14:anchorId="6CD7E661" wp14:editId="657CE465">
@@ -903,6 +954,9 @@
         <w:jc w:val="center"/>
       </w:pPr>
       <w:r>
+        <w:rPr>
+          <w:noProof/>
+        </w:rPr>
         <w:drawing>
           <wp:inline distT="0" distB="0" distL="0" distR="0" wp14:anchorId="316E7242" wp14:editId="10A83DCC">
             <wp:extent cx="5943600" cy="3411220"/>
@@ -928,6 +982,219 @@
                     <a:xfrm>
                       <a:off x="0" y="0"/>
                       <a:ext cx="5943600" cy="3411220"/>
+                    </a:xfrm>
+                    <a:prstGeom prst="rect">
+                      <a:avLst/>
+                    </a:prstGeom>
+                  </pic:spPr>
+                </pic:pic>
+              </a:graphicData>
+            </a:graphic>
+          </wp:inline>
+        </w:drawing>
+      </w:r>
+    </w:p>
+    <w:p>
+      <w:pPr>
+        <w:jc w:val="center"/>
+      </w:pPr>
+      <w:r>
+        <w:lastRenderedPageBreak/>
+        <w:drawing>
+          <wp:inline distT="0" distB="0" distL="0" distR="0" wp14:anchorId="51F18EAF" wp14:editId="65E9459E">
+            <wp:extent cx="5943600" cy="2890520"/>
+            <wp:effectExtent l="0" t="0" r="0" b="5080"/>
+            <wp:docPr id="24" name="Picture 24"/>
+            <wp:cNvGraphicFramePr>
+              <a:graphicFrameLocks xmlns:a="http://schemas.openxmlformats.org/drawingml/2006/main" noChangeAspect="1"/>
+            </wp:cNvGraphicFramePr>
+            <a:graphic xmlns:a="http://schemas.openxmlformats.org/drawingml/2006/main">
+              <a:graphicData uri="http://schemas.openxmlformats.org/drawingml/2006/picture">
+                <pic:pic xmlns:pic="http://schemas.openxmlformats.org/drawingml/2006/picture">
+                  <pic:nvPicPr>
+                    <pic:cNvPr id="1" name=""/>
+                    <pic:cNvPicPr/>
+                  </pic:nvPicPr>
+                  <pic:blipFill>
+                    <a:blip r:embed="rId27"/>
+                    <a:stretch>
+                      <a:fillRect/>
+                    </a:stretch>
+                  </pic:blipFill>
+                  <pic:spPr>
+                    <a:xfrm>
+                      <a:off x="0" y="0"/>
+                      <a:ext cx="5943600" cy="2890520"/>
+                    </a:xfrm>
+                    <a:prstGeom prst="rect">
+                      <a:avLst/>
+                    </a:prstGeom>
+                  </pic:spPr>
+                </pic:pic>
+              </a:graphicData>
+            </a:graphic>
+          </wp:inline>
+        </w:drawing>
+      </w:r>
+    </w:p>
+    <w:p>
+      <w:pPr>
+        <w:jc w:val="center"/>
+      </w:pPr>
+      <w:r>
+        <w:drawing>
+          <wp:inline distT="0" distB="0" distL="0" distR="0" wp14:anchorId="5E2B42F2" wp14:editId="174734CE">
+            <wp:extent cx="5943600" cy="3024505"/>
+            <wp:effectExtent l="0" t="0" r="0" b="4445"/>
+            <wp:docPr id="25" name="Picture 25"/>
+            <wp:cNvGraphicFramePr>
+              <a:graphicFrameLocks xmlns:a="http://schemas.openxmlformats.org/drawingml/2006/main" noChangeAspect="1"/>
+            </wp:cNvGraphicFramePr>
+            <a:graphic xmlns:a="http://schemas.openxmlformats.org/drawingml/2006/main">
+              <a:graphicData uri="http://schemas.openxmlformats.org/drawingml/2006/picture">
+                <pic:pic xmlns:pic="http://schemas.openxmlformats.org/drawingml/2006/picture">
+                  <pic:nvPicPr>
+                    <pic:cNvPr id="1" name=""/>
+                    <pic:cNvPicPr/>
+                  </pic:nvPicPr>
+                  <pic:blipFill>
+                    <a:blip r:embed="rId28"/>
+                    <a:stretch>
+                      <a:fillRect/>
+                    </a:stretch>
+                  </pic:blipFill>
+                  <pic:spPr>
+                    <a:xfrm>
+                      <a:off x="0" y="0"/>
+                      <a:ext cx="5943600" cy="3024505"/>
+                    </a:xfrm>
+                    <a:prstGeom prst="rect">
+                      <a:avLst/>
+                    </a:prstGeom>
+                  </pic:spPr>
+                </pic:pic>
+              </a:graphicData>
+            </a:graphic>
+          </wp:inline>
+        </w:drawing>
+      </w:r>
+    </w:p>
+    <w:p>
+      <w:pPr>
+        <w:jc w:val="center"/>
+      </w:pPr>
+      <w:r>
+        <w:lastRenderedPageBreak/>
+        <w:drawing>
+          <wp:inline distT="0" distB="0" distL="0" distR="0" wp14:anchorId="76D9F2F0" wp14:editId="6EAA0063">
+            <wp:extent cx="5943600" cy="3529965"/>
+            <wp:effectExtent l="0" t="0" r="0" b="0"/>
+            <wp:docPr id="26" name="Picture 26"/>
+            <wp:cNvGraphicFramePr>
+              <a:graphicFrameLocks xmlns:a="http://schemas.openxmlformats.org/drawingml/2006/main" noChangeAspect="1"/>
+            </wp:cNvGraphicFramePr>
+            <a:graphic xmlns:a="http://schemas.openxmlformats.org/drawingml/2006/main">
+              <a:graphicData uri="http://schemas.openxmlformats.org/drawingml/2006/picture">
+                <pic:pic xmlns:pic="http://schemas.openxmlformats.org/drawingml/2006/picture">
+                  <pic:nvPicPr>
+                    <pic:cNvPr id="1" name=""/>
+                    <pic:cNvPicPr/>
+                  </pic:nvPicPr>
+                  <pic:blipFill>
+                    <a:blip r:embed="rId29"/>
+                    <a:stretch>
+                      <a:fillRect/>
+                    </a:stretch>
+                  </pic:blipFill>
+                  <pic:spPr>
+                    <a:xfrm>
+                      <a:off x="0" y="0"/>
+                      <a:ext cx="5943600" cy="3529965"/>
+                    </a:xfrm>
+                    <a:prstGeom prst="rect">
+                      <a:avLst/>
+                    </a:prstGeom>
+                  </pic:spPr>
+                </pic:pic>
+              </a:graphicData>
+            </a:graphic>
+          </wp:inline>
+        </w:drawing>
+      </w:r>
+    </w:p>
+    <w:p>
+      <w:pPr>
+        <w:jc w:val="center"/>
+      </w:pPr>
+      <w:r>
+        <w:drawing>
+          <wp:inline distT="0" distB="0" distL="0" distR="0" wp14:anchorId="29A202EE" wp14:editId="3EE56D70">
+            <wp:extent cx="5943600" cy="3638550"/>
+            <wp:effectExtent l="0" t="0" r="0" b="0"/>
+            <wp:docPr id="27" name="Picture 27"/>
+            <wp:cNvGraphicFramePr>
+              <a:graphicFrameLocks xmlns:a="http://schemas.openxmlformats.org/drawingml/2006/main" noChangeAspect="1"/>
+            </wp:cNvGraphicFramePr>
+            <a:graphic xmlns:a="http://schemas.openxmlformats.org/drawingml/2006/main">
+              <a:graphicData uri="http://schemas.openxmlformats.org/drawingml/2006/picture">
+                <pic:pic xmlns:pic="http://schemas.openxmlformats.org/drawingml/2006/picture">
+                  <pic:nvPicPr>
+                    <pic:cNvPr id="1" name=""/>
+                    <pic:cNvPicPr/>
+                  </pic:nvPicPr>
+                  <pic:blipFill>
+                    <a:blip r:embed="rId30"/>
+                    <a:stretch>
+                      <a:fillRect/>
+                    </a:stretch>
+                  </pic:blipFill>
+                  <pic:spPr>
+                    <a:xfrm>
+                      <a:off x="0" y="0"/>
+                      <a:ext cx="5943600" cy="3638550"/>
+                    </a:xfrm>
+                    <a:prstGeom prst="rect">
+                      <a:avLst/>
+                    </a:prstGeom>
+                  </pic:spPr>
+                </pic:pic>
+              </a:graphicData>
+            </a:graphic>
+          </wp:inline>
+        </w:drawing>
+      </w:r>
+    </w:p>
+    <w:p>
+      <w:pPr>
+        <w:jc w:val="center"/>
+      </w:pPr>
+      <w:r>
+        <w:lastRenderedPageBreak/>
+        <w:drawing>
+          <wp:inline distT="0" distB="0" distL="0" distR="0" wp14:anchorId="731C6E5E" wp14:editId="1CAEF973">
+            <wp:extent cx="5943600" cy="3792855"/>
+            <wp:effectExtent l="0" t="0" r="0" b="0"/>
+            <wp:docPr id="28" name="Picture 28"/>
+            <wp:cNvGraphicFramePr>
+              <a:graphicFrameLocks xmlns:a="http://schemas.openxmlformats.org/drawingml/2006/main" noChangeAspect="1"/>
+            </wp:cNvGraphicFramePr>
+            <a:graphic xmlns:a="http://schemas.openxmlformats.org/drawingml/2006/main">
+              <a:graphicData uri="http://schemas.openxmlformats.org/drawingml/2006/picture">
+                <pic:pic xmlns:pic="http://schemas.openxmlformats.org/drawingml/2006/picture">
+                  <pic:nvPicPr>
+                    <pic:cNvPr id="1" name=""/>
+                    <pic:cNvPicPr/>
+                  </pic:nvPicPr>
+                  <pic:blipFill>
+                    <a:blip r:embed="rId31"/>
+                    <a:stretch>
+                      <a:fillRect/>
+                    </a:stretch>
+                  </pic:blipFill>
+                  <pic:spPr>
+                    <a:xfrm>
+                      <a:off x="0" y="0"/>
+                      <a:ext cx="5943600" cy="3792855"/>
                     </a:xfrm>
                     <a:prstGeom prst="rect">
                       <a:avLst/>

</xml_diff>